<commit_message>
Add shadcn UI foundation and update documentation
</commit_message>
<xml_diff>
--- a/docs/inspannings-monitor-05-technische-architectuur-en-implementatie-v01.docx
+++ b/docs/inspannings-monitor-05-technische-architectuur-en-implementatie-v01.docx
@@ -488,7 +488,7 @@
           </w:tcPr>
           <w:p>
             <w:r>
-              <w:t>Tailwind CSS + componentbibliotheek</w:t>
+              <w:t>Tailwind CSS + shadcn/ui</w:t>
             </w:r>
           </w:p>
         </w:tc>
@@ -498,7 +498,7 @@
           </w:tcPr>
           <w:p>
             <w:r>
-              <w:t>Snel consistente, toegankelijke UI voor mobile-first flows.</w:t>
+              <w:t>Semantische componenten en centrale theme tokens houden de UI consistenter en beter onderhoudbaar.</w:t>
             </w:r>
           </w:p>
         </w:tc>

</xml_diff>